<commit_message>
Add team names and repository link to scoping document
</commit_message>
<xml_diff>
--- a/docs/Clinical_Trial_Termination_Project_Scoping.docx
+++ b/docs/Clinical_Trial_Termination_Project_Scoping.docx
@@ -48,7 +48,7 @@
         <w:pStyle w:val="ListBullet"/>
       </w:pPr>
       <w:r>
-        <w:t>[FILL: Team Member 1]</w:t>
+        <w:t>Pavanchytanya Dharmapuri (Group Leader)</w:t>
       </w:r>
     </w:p>
     <w:p>
@@ -56,7 +56,7 @@
         <w:pStyle w:val="ListBullet"/>
       </w:pPr>
       <w:r>
-        <w:t>[FILL: Team Member 2]</w:t>
+        <w:t>Atharva Nilesh Mahadik</w:t>
       </w:r>
     </w:p>
     <w:p>
@@ -64,7 +64,7 @@
         <w:pStyle w:val="ListBullet"/>
       </w:pPr>
       <w:r>
-        <w:t>[FILL: Team Member 3]</w:t>
+        <w:t>Danush Gopinath</w:t>
       </w:r>
     </w:p>
     <w:p>
@@ -72,7 +72,7 @@
         <w:pStyle w:val="ListBullet"/>
       </w:pPr>
       <w:r>
-        <w:t>[FILL: Team Member 4]</w:t>
+        <w:t>Nithish Bhat</w:t>
       </w:r>
     </w:p>
     <w:p>
@@ -80,7 +80,15 @@
         <w:pStyle w:val="ListBullet"/>
       </w:pPr>
       <w:r>
-        <w:t>[FILL: Team Member 5]</w:t>
+        <w:t>Sathyasai Rajan</w:t>
+      </w:r>
+    </w:p>
+    <w:p>
+      <w:pPr>
+        <w:pStyle w:val="ListBullet"/>
+      </w:pPr>
+      <w:r>
+        <w:t>Sivapriya Sugumaran</w:t>
       </w:r>
     </w:p>
     <w:p>
@@ -1041,10 +1049,12 @@
       <w:pPr/>
       <w:r>
         <w:rPr>
-          <w:b w:val="0"/>
-          <w:i w:val="0"/>
+          <w:b/>
         </w:rPr>
-        <w:t>Repository link: [FILL: GitHub repo URL]</w:t>
+        <w:t>Repository link:</w:t>
+      </w:r>
+      <w:r>
+        <w:t xml:space="preserve"> https://github.com/PavanchytanyaD/clinical-trial-termination (private; team members and the instructor are added as collaborators)</w:t>
       </w:r>
     </w:p>
     <w:p>

</xml_diff>

<commit_message>
List team members alphabetically
</commit_message>
<xml_diff>
--- a/docs/Clinical_Trial_Termination_Project_Scoping.docx
+++ b/docs/Clinical_Trial_Termination_Project_Scoping.docx
@@ -48,14 +48,6 @@
         <w:pStyle w:val="ListBullet"/>
       </w:pPr>
       <w:r>
-        <w:t>Pavanchytanya Dharmapuri (Group Leader)</w:t>
-      </w:r>
-    </w:p>
-    <w:p>
-      <w:pPr>
-        <w:pStyle w:val="ListBullet"/>
-      </w:pPr>
-      <w:r>
         <w:t>Atharva Nilesh Mahadik</w:t>
       </w:r>
     </w:p>
@@ -73,6 +65,14 @@
       </w:pPr>
       <w:r>
         <w:t>Nithish Bhat</w:t>
+      </w:r>
+    </w:p>
+    <w:p>
+      <w:pPr>
+        <w:pStyle w:val="ListBullet"/>
+      </w:pPr>
+      <w:r>
+        <w:t>Pavanchytanya Dharmapuri (Group Leader)</w:t>
       </w:r>
     </w:p>
     <w:p>

</xml_diff>

<commit_message>
Align timeline with course due dates and clean document properties
</commit_message>
<xml_diff>
--- a/docs/Clinical_Trial_Termination_Project_Scoping.docx
+++ b/docs/Clinical_Trial_Termination_Project_Scoping.docx
@@ -2854,7 +2854,7 @@
           <w:b w:val="0"/>
           <w:i w:val="0"/>
         </w:rPr>
-        <w:t>A preliminary plan for October to mid-December 2026, aligned with the course milestones. It can change with deadlines and constraints.</w:t>
+        <w:t>A preliminary plan for October to early December 2026, aligned with the course milestone due dates. It can change with deadlines and constraints.</w:t>
       </w:r>
     </w:p>
     <w:tbl>
@@ -2865,14 +2865,15 @@
         <w:tblLook w:firstColumn="1" w:firstRow="1" w:lastColumn="0" w:lastRow="0" w:noHBand="0" w:noVBand="1" w:val="04A0"/>
       </w:tblPr>
       <w:tblGrid>
-        <w:gridCol w:w="1872"/>
-        <w:gridCol w:w="1872"/>
-        <w:gridCol w:w="5616"/>
+        <w:gridCol w:w="1944"/>
+        <w:gridCol w:w="2376"/>
+        <w:gridCol w:w="1080"/>
+        <w:gridCol w:w="3960"/>
       </w:tblGrid>
       <w:tr>
         <w:tc>
           <w:tcPr>
-            <w:tcW w:type="dxa" w:w="1872"/>
+            <w:tcW w:type="dxa" w:w="1944"/>
             <w:shd w:val="clear" w:color="auto" w:fill="E8EEF7"/>
           </w:tcPr>
           <w:p>
@@ -2888,7 +2889,7 @@
         </w:tc>
         <w:tc>
           <w:tcPr>
-            <w:tcW w:type="dxa" w:w="1872"/>
+            <w:tcW w:type="dxa" w:w="2376"/>
             <w:shd w:val="clear" w:color="auto" w:fill="E8EEF7"/>
           </w:tcPr>
           <w:p>
@@ -2904,7 +2905,23 @@
         </w:tc>
         <w:tc>
           <w:tcPr>
-            <w:tcW w:type="dxa" w:w="5616"/>
+            <w:tcW w:type="dxa" w:w="1080"/>
+            <w:shd w:val="clear" w:color="auto" w:fill="E8EEF7"/>
+          </w:tcPr>
+          <w:p>
+            <w:r/>
+            <w:r>
+              <w:rPr>
+                <w:b/>
+                <w:sz w:val="21"/>
+              </w:rPr>
+              <w:t>Due date</w:t>
+            </w:r>
+          </w:p>
+        </w:tc>
+        <w:tc>
+          <w:tcPr>
+            <w:tcW w:type="dxa" w:w="3960"/>
             <w:shd w:val="clear" w:color="auto" w:fill="E8EEF7"/>
           </w:tcPr>
           <w:p>
@@ -2922,7 +2939,7 @@
       <w:tr>
         <w:tc>
           <w:tcPr>
-            <w:tcW w:type="dxa" w:w="1872"/>
+            <w:tcW w:type="dxa" w:w="1944"/>
           </w:tcPr>
           <w:p>
             <w:r/>
@@ -2931,13 +2948,13 @@
                 <w:b/>
                 <w:sz w:val="21"/>
               </w:rPr>
-              <w:t>Oct 1 to Oct 10</w:t>
+              <w:t>Oct 1 to Oct 4</w:t>
             </w:r>
           </w:p>
         </w:tc>
         <w:tc>
           <w:tcPr>
-            <w:tcW w:type="dxa" w:w="1872"/>
+            <w:tcW w:type="dxa" w:w="2376"/>
           </w:tcPr>
           <w:p>
             <w:r/>
@@ -2945,13 +2962,27 @@
               <w:rPr>
                 <w:sz w:val="21"/>
               </w:rPr>
-              <w:t>Scoping</w:t>
+              <w:t>Project scoping</w:t>
             </w:r>
           </w:p>
         </w:tc>
         <w:tc>
           <w:tcPr>
-            <w:tcW w:type="dxa" w:w="5616"/>
+            <w:tcW w:type="dxa" w:w="1080"/>
+          </w:tcPr>
+          <w:p>
+            <w:r/>
+            <w:r>
+              <w:rPr>
+                <w:sz w:val="21"/>
+              </w:rPr>
+              <w:t>Oct 4</w:t>
+            </w:r>
+          </w:p>
+        </w:tc>
+        <w:tc>
+          <w:tcPr>
+            <w:tcW w:type="dxa" w:w="3960"/>
           </w:tcPr>
           <w:p>
             <w:r/>
@@ -2967,7 +2998,7 @@
       <w:tr>
         <w:tc>
           <w:tcPr>
-            <w:tcW w:type="dxa" w:w="1872"/>
+            <w:tcW w:type="dxa" w:w="1944"/>
           </w:tcPr>
           <w:p>
             <w:r/>
@@ -2976,13 +3007,13 @@
                 <w:b/>
                 <w:sz w:val="21"/>
               </w:rPr>
-              <w:t>Oct 11 to Oct 31</w:t>
+              <w:t>Oct 5 to Oct 25</w:t>
             </w:r>
           </w:p>
         </w:tc>
         <w:tc>
           <w:tcPr>
-            <w:tcW w:type="dxa" w:w="1872"/>
+            <w:tcW w:type="dxa" w:w="2376"/>
           </w:tcPr>
           <w:p>
             <w:r/>
@@ -2996,7 +3027,21 @@
         </w:tc>
         <w:tc>
           <w:tcPr>
-            <w:tcW w:type="dxa" w:w="5616"/>
+            <w:tcW w:type="dxa" w:w="1080"/>
+          </w:tcPr>
+          <w:p>
+            <w:r/>
+            <w:r>
+              <w:rPr>
+                <w:sz w:val="21"/>
+              </w:rPr>
+              <w:t>Oct 25</w:t>
+            </w:r>
+          </w:p>
+        </w:tc>
+        <w:tc>
+          <w:tcPr>
+            <w:tcW w:type="dxa" w:w="3960"/>
           </w:tcPr>
           <w:p>
             <w:r/>
@@ -3012,7 +3057,7 @@
       <w:tr>
         <w:tc>
           <w:tcPr>
-            <w:tcW w:type="dxa" w:w="1872"/>
+            <w:tcW w:type="dxa" w:w="1944"/>
           </w:tcPr>
           <w:p>
             <w:r/>
@@ -3021,13 +3066,13 @@
                 <w:b/>
                 <w:sz w:val="21"/>
               </w:rPr>
-              <w:t>Nov 1 to Nov 21</w:t>
+              <w:t>Oct 26 to Nov 15</w:t>
             </w:r>
           </w:p>
         </w:tc>
         <w:tc>
           <w:tcPr>
-            <w:tcW w:type="dxa" w:w="1872"/>
+            <w:tcW w:type="dxa" w:w="2376"/>
           </w:tcPr>
           <w:p>
             <w:r/>
@@ -3035,13 +3080,27 @@
               <w:rPr>
                 <w:sz w:val="21"/>
               </w:rPr>
-              <w:t>Model pipeline</w:t>
+              <w:t>Model development pipeline</w:t>
             </w:r>
           </w:p>
         </w:tc>
         <w:tc>
           <w:tcPr>
-            <w:tcW w:type="dxa" w:w="5616"/>
+            <w:tcW w:type="dxa" w:w="1080"/>
+          </w:tcPr>
+          <w:p>
+            <w:r/>
+            <w:r>
+              <w:rPr>
+                <w:sz w:val="21"/>
+              </w:rPr>
+              <w:t>Nov 15</w:t>
+            </w:r>
+          </w:p>
+        </w:tc>
+        <w:tc>
+          <w:tcPr>
+            <w:tcW w:type="dxa" w:w="3960"/>
           </w:tcPr>
           <w:p>
             <w:r/>
@@ -3057,7 +3116,7 @@
       <w:tr>
         <w:tc>
           <w:tcPr>
-            <w:tcW w:type="dxa" w:w="1872"/>
+            <w:tcW w:type="dxa" w:w="1944"/>
           </w:tcPr>
           <w:p>
             <w:r/>
@@ -3066,13 +3125,13 @@
                 <w:b/>
                 <w:sz w:val="21"/>
               </w:rPr>
-              <w:t>Nov 22 to Dec 5</w:t>
+              <w:t>Nov 16 to Dec 6</w:t>
             </w:r>
           </w:p>
         </w:tc>
         <w:tc>
           <w:tcPr>
-            <w:tcW w:type="dxa" w:w="1872"/>
+            <w:tcW w:type="dxa" w:w="2376"/>
           </w:tcPr>
           <w:p>
             <w:r/>
@@ -3080,13 +3139,13 @@
               <w:rPr>
                 <w:sz w:val="21"/>
               </w:rPr>
-              <w:t>Deployment</w:t>
+              <w:t>Model deployment</w:t>
             </w:r>
           </w:p>
         </w:tc>
         <w:tc>
           <w:tcPr>
-            <w:tcW w:type="dxa" w:w="5616"/>
+            <w:tcW w:type="dxa" w:w="1080"/>
           </w:tcPr>
           <w:p>
             <w:r/>
@@ -3094,7 +3153,21 @@
               <w:rPr>
                 <w:sz w:val="21"/>
               </w:rPr>
-              <w:t>CI/CD and container images, Vertex AI pipeline, GKE inference service, online evaluation, monitoring and alerts</w:t>
+              <w:t>Dec 6</w:t>
+            </w:r>
+          </w:p>
+        </w:tc>
+        <w:tc>
+          <w:tcPr>
+            <w:tcW w:type="dxa" w:w="3960"/>
+          </w:tcPr>
+          <w:p>
+            <w:r/>
+            <w:r>
+              <w:rPr>
+                <w:sz w:val="21"/>
+              </w:rPr>
+              <w:t>CI/CD and container images, Vertex AI pipeline, GKE inference service, online evaluation, monitoring and alerts, end-to-end testing</w:t>
             </w:r>
           </w:p>
         </w:tc>
@@ -3102,7 +3175,7 @@
       <w:tr>
         <w:tc>
           <w:tcPr>
-            <w:tcW w:type="dxa" w:w="1872"/>
+            <w:tcW w:type="dxa" w:w="1944"/>
           </w:tcPr>
           <w:p>
             <w:r/>
@@ -3111,13 +3184,13 @@
                 <w:b/>
                 <w:sz w:val="21"/>
               </w:rPr>
-              <w:t>Dec 6 to Dec 12</w:t>
+              <w:t>Dec 7</w:t>
             </w:r>
           </w:p>
         </w:tc>
         <w:tc>
           <w:tcPr>
-            <w:tcW w:type="dxa" w:w="1872"/>
+            <w:tcW w:type="dxa" w:w="2376"/>
           </w:tcPr>
           <w:p>
             <w:r/>
@@ -3125,13 +3198,13 @@
               <w:rPr>
                 <w:sz w:val="21"/>
               </w:rPr>
-              <w:t>Final</w:t>
+              <w:t>MLOps Expo (demo day)</w:t>
             </w:r>
           </w:p>
         </w:tc>
         <w:tc>
           <w:tcPr>
-            <w:tcW w:type="dxa" w:w="5616"/>
+            <w:tcW w:type="dxa" w:w="1080"/>
           </w:tcPr>
           <w:p>
             <w:r/>
@@ -3139,7 +3212,21 @@
               <w:rPr>
                 <w:sz w:val="21"/>
               </w:rPr>
-              <w:t>End-to-end testing, documentation, final presentation</w:t>
+              <w:t>Dec 7</w:t>
+            </w:r>
+          </w:p>
+        </w:tc>
+        <w:tc>
+          <w:tcPr>
+            <w:tcW w:type="dxa" w:w="3960"/>
+          </w:tcPr>
+          <w:p>
+            <w:r/>
+            <w:r>
+              <w:rPr>
+                <w:sz w:val="21"/>
+              </w:rPr>
+              <w:t>Live demo and final presentation</w:t>
             </w:r>
           </w:p>
         </w:tc>

</xml_diff>

<commit_message>
Add Managing Data section and match section 6 title to rubric
</commit_message>
<xml_diff>
--- a/docs/Clinical_Trial_Termination_Project_Scoping.docx
+++ b/docs/Clinical_Trial_Termination_Project_Scoping.docx
@@ -184,7 +184,7 @@
           <w:b w:val="0"/>
           <w:i w:val="0"/>
         </w:rPr>
-        <w:t>6. Current Approach and Bottlenecks</w:t>
+        <w:t>6. Current Approach Flow Chart and Bottleneck Detection</w:t>
       </w:r>
     </w:p>
     <w:p>
@@ -890,7 +890,57 @@
         <w:pStyle w:val="Heading2"/>
       </w:pPr>
       <w:r>
-        <w:t>3.3 Splitting the Data</w:t>
+        <w:t>3.3 Managing Data</w:t>
+      </w:r>
+    </w:p>
+    <w:p>
+      <w:pPr>
+        <w:pStyle w:val="ListBullet"/>
+      </w:pPr>
+      <w:r>
+        <w:rPr>
+          <w:b/>
+        </w:rPr>
+        <w:t>Versioning:</w:t>
+      </w:r>
+      <w:r>
+        <w:t xml:space="preserve"> every raw snapshot and processed dataset is versioned with DVC, so each model can be traced back to the exact data it was trained on.</w:t>
+      </w:r>
+    </w:p>
+    <w:p>
+      <w:pPr>
+        <w:pStyle w:val="ListBullet"/>
+      </w:pPr>
+      <w:r>
+        <w:rPr>
+          <w:b/>
+        </w:rPr>
+        <w:t>Storage:</w:t>
+      </w:r>
+      <w:r>
+        <w:t xml:space="preserve"> raw snapshots are kept in Cloud Storage; cleaned features, embeddings, and splits are kept in BigQuery. Raw data is never stored in GitHub, only the small DVC pointer files.</w:t>
+      </w:r>
+    </w:p>
+    <w:p>
+      <w:pPr>
+        <w:pStyle w:val="ListBullet"/>
+      </w:pPr>
+      <w:r>
+        <w:rPr>
+          <w:b/>
+        </w:rPr>
+        <w:t>Quality checks:</w:t>
+      </w:r>
+      <w:r>
+        <w:t xml:space="preserve"> each new snapshot is checked for the expected schema, missing values, and valid ranges. A failed check stops the pipeline and raises an alert.</w:t>
+      </w:r>
+    </w:p>
+    <w:p>
+      <w:pPr>
+        <w:pStyle w:val="Heading2"/>
+      </w:pPr>
+      <w:r>
+        <w:t>3.4 Splitting the Data</w:t>
       </w:r>
     </w:p>
     <w:p>
@@ -964,7 +1014,7 @@
         <w:pStyle w:val="Heading2"/>
       </w:pPr>
       <w:r>
-        <w:t>3.4 Feature Set</w:t>
+        <w:t>3.5 Feature Set</w:t>
       </w:r>
     </w:p>
     <w:p>
@@ -1334,7 +1384,7 @@
         <w:pStyle w:val="Heading1"/>
       </w:pPr>
       <w:r>
-        <w:t>6. Current Approach and Bottlenecks</w:t>
+        <w:t>6. Current Approach Flow Chart and Bottleneck Detection</w:t>
       </w:r>
     </w:p>
     <w:p>

</xml_diff>